<commit_message>
đã fix lại import PC, HĐ, NKCT. test xuất ĐNTT word zip đã ok. test xuất ĐNTT excel cần sửa: KyThanhToan = tháng/năm tương ứng với kỳ can thiệp. Thêm ô chọn Người đề nghị (danh sách droplist gồm các CB có mã AVH)
</commit_message>
<xml_diff>
--- a/quanly/document_templates/hop_dong/Mau_HopDong.docx
+++ b/quanly/document_templates/hop_dong/Mau_HopDong.docx
@@ -11836,6 +11836,16 @@
           <w:szCs w:val="24"/>
         </w:rPr>
       </w:pPr>
+      <w:r>
+        <w:rPr>
+          <w:rFonts w:ascii="Times New Roman" w:hAnsi="Times New Roman"/>
+          <w:b/>
+          <w:color w:val="000000"/>
+          <w:sz w:val="24"/>
+          <w:szCs w:val="24"/>
+        </w:rPr>
+        <w:t xml:space="preserve">Đợt </w:t>
+      </w:r>
       <w:r>
         <w:rPr>
           <w:rFonts w:ascii="Times New Roman" w:hAnsi="Times New Roman"/>
@@ -16896,26 +16906,6 @@
 </file>
 
 <file path=customXml/item1.xml><?xml version="1.0" encoding="utf-8"?>
-<?mso-contentType ?>
-<FormTemplates xmlns="http://schemas.microsoft.com/sharepoint/v3/contenttype/forms">
-  <Display>DocumentLibraryForm</Display>
-  <Edit>DocumentLibraryForm</Edit>
-  <New>DocumentLibraryForm</New>
-</FormTemplates>
-</file>
-
-<file path=customXml/item2.xml><?xml version="1.0" encoding="utf-8"?>
-<p:properties xmlns:p="http://schemas.microsoft.com/office/2006/metadata/properties" xmlns:xsi="http://www.w3.org/2001/XMLSchema-instance" xmlns:pc="http://schemas.microsoft.com/office/infopath/2007/PartnerControls">
-  <documentManagement>
-    <lcf76f155ced4ddcb4097134ff3c332f xmlns="73a44f49-6332-49a7-8493-cbab40408c43">
-      <Terms xmlns="http://schemas.microsoft.com/office/infopath/2007/PartnerControls"/>
-    </lcf76f155ced4ddcb4097134ff3c332f>
-    <TaxCatchAll xmlns="447cc794-a73c-4620-8d3f-aab38a7b13a9" xsi:nil="true"/>
-  </documentManagement>
-</p:properties>
-</file>
-
-<file path=customXml/item3.xml><?xml version="1.0" encoding="utf-8"?>
 <ct:contentTypeSchema xmlns:ct="http://schemas.microsoft.com/office/2006/metadata/contentType" xmlns:ma="http://schemas.microsoft.com/office/2006/metadata/properties/metaAttributes" ct:_="" ma:_="" ma:contentTypeName="Document" ma:contentTypeID="0x0101008984269AA5E1EE4AB5866412DA8D0060" ma:contentTypeVersion="13" ma:contentTypeDescription="Create a new document." ma:contentTypeScope="" ma:versionID="9c16e6674a437c829b4fbe8a362f3baa">
   <xsd:schema xmlns:xsd="http://www.w3.org/2001/XMLSchema" xmlns:xs="http://www.w3.org/2001/XMLSchema" xmlns:p="http://schemas.microsoft.com/office/2006/metadata/properties" xmlns:ns2="73a44f49-6332-49a7-8493-cbab40408c43" xmlns:ns3="447cc794-a73c-4620-8d3f-aab38a7b13a9" targetNamespace="http://schemas.microsoft.com/office/2006/metadata/properties" ma:root="true" ma:fieldsID="8a30c53a86808fe298f45a5d1e5a6cb2" ns2:_="" ns3:_="">
     <xsd:import namespace="73a44f49-6332-49a7-8493-cbab40408c43"/>
@@ -17122,30 +17112,31 @@
 </ct:contentTypeSchema>
 </file>
 
+<file path=customXml/item2.xml><?xml version="1.0" encoding="utf-8"?>
+<p:properties xmlns:p="http://schemas.microsoft.com/office/2006/metadata/properties" xmlns:xsi="http://www.w3.org/2001/XMLSchema-instance" xmlns:pc="http://schemas.microsoft.com/office/infopath/2007/PartnerControls">
+  <documentManagement>
+    <lcf76f155ced4ddcb4097134ff3c332f xmlns="73a44f49-6332-49a7-8493-cbab40408c43">
+      <Terms xmlns="http://schemas.microsoft.com/office/infopath/2007/PartnerControls"/>
+    </lcf76f155ced4ddcb4097134ff3c332f>
+    <TaxCatchAll xmlns="447cc794-a73c-4620-8d3f-aab38a7b13a9" xsi:nil="true"/>
+  </documentManagement>
+</p:properties>
+</file>
+
+<file path=customXml/item3.xml><?xml version="1.0" encoding="utf-8"?>
+<?mso-contentType ?>
+<FormTemplates xmlns="http://schemas.microsoft.com/sharepoint/v3/contenttype/forms">
+  <Display>DocumentLibraryForm</Display>
+  <Edit>DocumentLibraryForm</Edit>
+  <New>DocumentLibraryForm</New>
+</FormTemplates>
+</file>
+
 <file path=customXml/item4.xml><?xml version="1.0" encoding="utf-8"?>
 <b:Sources xmlns:b="http://schemas.openxmlformats.org/officeDocument/2006/bibliography" xmlns="http://schemas.openxmlformats.org/officeDocument/2006/bibliography" SelectedStyle="\APA.XSL" StyleName="APA"/>
 </file>
 
 <file path=customXml/itemProps1.xml><?xml version="1.0" encoding="utf-8"?>
-<ds:datastoreItem xmlns:ds="http://schemas.openxmlformats.org/officeDocument/2006/customXml" ds:itemID="{D3CD3758-582D-4DB2-BDAD-83B3108E3FFC}">
-  <ds:schemaRefs>
-    <ds:schemaRef ds:uri="http://schemas.microsoft.com/sharepoint/v3/contenttype/forms"/>
-  </ds:schemaRefs>
-</ds:datastoreItem>
-</file>
-
-<file path=customXml/itemProps2.xml><?xml version="1.0" encoding="utf-8"?>
-<ds:datastoreItem xmlns:ds="http://schemas.openxmlformats.org/officeDocument/2006/customXml" ds:itemID="{1670CE93-4D18-4BC1-9992-EB5A423FE977}">
-  <ds:schemaRefs>
-    <ds:schemaRef ds:uri="http://schemas.microsoft.com/office/2006/metadata/properties"/>
-    <ds:schemaRef ds:uri="http://schemas.microsoft.com/office/infopath/2007/PartnerControls"/>
-    <ds:schemaRef ds:uri="73a44f49-6332-49a7-8493-cbab40408c43"/>
-    <ds:schemaRef ds:uri="447cc794-a73c-4620-8d3f-aab38a7b13a9"/>
-  </ds:schemaRefs>
-</ds:datastoreItem>
-</file>
-
-<file path=customXml/itemProps3.xml><?xml version="1.0" encoding="utf-8"?>
 <ds:datastoreItem xmlns:ds="http://schemas.openxmlformats.org/officeDocument/2006/customXml" ds:itemID="{F903AFD1-E73B-4CEE-8720-10F40F7CCD1C}">
   <ds:schemaRefs>
     <ds:schemaRef ds:uri="http://schemas.microsoft.com/office/2006/metadata/contentType"/>
@@ -17164,6 +17155,25 @@
 </ds:datastoreItem>
 </file>
 
+<file path=customXml/itemProps2.xml><?xml version="1.0" encoding="utf-8"?>
+<ds:datastoreItem xmlns:ds="http://schemas.openxmlformats.org/officeDocument/2006/customXml" ds:itemID="{1670CE93-4D18-4BC1-9992-EB5A423FE977}">
+  <ds:schemaRefs>
+    <ds:schemaRef ds:uri="http://schemas.microsoft.com/office/2006/metadata/properties"/>
+    <ds:schemaRef ds:uri="http://schemas.microsoft.com/office/infopath/2007/PartnerControls"/>
+    <ds:schemaRef ds:uri="73a44f49-6332-49a7-8493-cbab40408c43"/>
+    <ds:schemaRef ds:uri="447cc794-a73c-4620-8d3f-aab38a7b13a9"/>
+  </ds:schemaRefs>
+</ds:datastoreItem>
+</file>
+
+<file path=customXml/itemProps3.xml><?xml version="1.0" encoding="utf-8"?>
+<ds:datastoreItem xmlns:ds="http://schemas.openxmlformats.org/officeDocument/2006/customXml" ds:itemID="{D3CD3758-582D-4DB2-BDAD-83B3108E3FFC}">
+  <ds:schemaRefs>
+    <ds:schemaRef ds:uri="http://schemas.microsoft.com/sharepoint/v3/contenttype/forms"/>
+  </ds:schemaRefs>
+</ds:datastoreItem>
+</file>
+
 <file path=customXml/itemProps4.xml><?xml version="1.0" encoding="utf-8"?>
 <ds:datastoreItem xmlns:ds="http://schemas.openxmlformats.org/officeDocument/2006/customXml" ds:itemID="{035CA9A6-8522-45D1-B611-FCDE5837FED3}">
   <ds:schemaRefs>

</xml_diff>

<commit_message>
Hoan thien nghiep vu thanh toan va chuan hoa mau xuat
</commit_message>
<xml_diff>
--- a/quanly/document_templates/hop_dong/Mau_HopDong.docx
+++ b/quanly/document_templates/hop_dong/Mau_HopDong.docx
@@ -4184,8 +4184,8 @@
         </w:rPr>
         <w:sectPr>
           <w:footerReference w:type="default" r:id="rId11"/>
-          <w:pgSz w:w="11907" w:h="16840" w:code="9"/>
-          <w:pgMar w:top="810" w:right="747" w:bottom="720" w:left="1134" w:header="720" w:footer="89" w:gutter="0"/>
+          <w:pgSz w:w="11906" w:h="16838" w:code="9"/>
+          <w:pgMar w:top="1134" w:right="1134" w:bottom="1134" w:left="1134" w:header="567" w:footer="567" w:gutter="0"/>
           <w:pgNumType w:start="1"/>
           <w:cols w:space="720"/>
           <w:docGrid w:linePitch="360"/>
@@ -5036,8 +5036,8 @@
           <w:szCs w:val="24"/>
         </w:rPr>
         <w:sectPr>
-          <w:pgSz w:w="11907" w:h="16840" w:code="9"/>
-          <w:pgMar w:top="810" w:right="747" w:bottom="720" w:left="1134" w:header="720" w:footer="89" w:gutter="0"/>
+          <w:pgSz w:w="11906" w:h="16838" w:code="9"/>
+          <w:pgMar w:top="1134" w:right="1134" w:bottom="1134" w:left="1134" w:header="567" w:footer="567" w:gutter="0"/>
           <w:cols w:space="720"/>
           <w:docGrid w:linePitch="360"/>
         </w:sectPr>
@@ -11784,8 +11784,8 @@
           <w:szCs w:val="24"/>
         </w:rPr>
         <w:sectPr>
-          <w:pgSz w:w="11907" w:h="16840" w:code="9"/>
-          <w:pgMar w:top="810" w:right="747" w:bottom="1080" w:left="1134" w:header="720" w:footer="89" w:gutter="0"/>
+          <w:pgSz w:w="11906" w:h="16838" w:code="9"/>
+          <w:pgMar w:top="1134" w:right="1134" w:bottom="1134" w:left="1134" w:header="567" w:footer="567" w:gutter="0"/>
           <w:cols w:space="720"/>
           <w:docGrid w:linePitch="360"/>
         </w:sectPr>
@@ -12418,8 +12418,8 @@
           <w:szCs w:val="24"/>
         </w:rPr>
         <w:sectPr>
-          <w:pgSz w:w="11907" w:h="16840" w:code="9"/>
-          <w:pgMar w:top="720" w:right="747" w:bottom="450" w:left="1134" w:header="720" w:footer="0" w:gutter="0"/>
+          <w:pgSz w:w="11906" w:h="16838" w:code="9"/>
+          <w:pgMar w:top="1134" w:right="1134" w:bottom="1134" w:left="1134" w:header="567" w:footer="567" w:gutter="0"/>
           <w:cols w:space="720"/>
           <w:docGrid w:linePitch="360"/>
         </w:sectPr>
@@ -13282,8 +13282,8 @@
           <w:szCs w:val="24"/>
         </w:rPr>
         <w:sectPr>
-          <w:pgSz w:w="11907" w:h="16840" w:code="9"/>
-          <w:pgMar w:top="1134" w:right="747" w:bottom="450" w:left="1134" w:header="720" w:footer="0" w:gutter="0"/>
+          <w:pgSz w:w="11906" w:h="16838" w:code="9"/>
+          <w:pgMar w:top="1134" w:right="1134" w:bottom="1134" w:left="1134" w:header="567" w:footer="567" w:gutter="0"/>
           <w:cols w:space="720"/>
           <w:docGrid w:linePitch="360"/>
         </w:sectPr>
@@ -13318,8 +13318,8 @@
     <w:sectPr>
       <w:footerReference w:type="default" r:id="rId12"/>
       <w:type w:val="continuous"/>
-      <w:pgSz w:w="11907" w:h="16840" w:code="9"/>
-      <w:pgMar w:top="1134" w:right="747" w:bottom="450" w:left="1134" w:header="720" w:footer="0" w:gutter="0"/>
+      <w:pgSz w:w="11906" w:h="16838" w:code="9"/>
+      <w:pgMar w:top="1134" w:right="1134" w:bottom="1134" w:left="1134" w:header="567" w:footer="567" w:gutter="0"/>
       <w:cols w:space="720"/>
       <w:docGrid w:linePitch="360"/>
     </w:sectPr>

</xml_diff>